<commit_message>
docs: link the four data collection videos in the README and report
</commit_message>
<xml_diff>
--- a/report/report.docx
+++ b/report/report.docx
@@ -45,7 +45,7 @@
         </w:rPr>
         <w:t xml:space="preserve">Code and data: </w:t>
       </w:r>
-      <w:hyperlink w:history="1" r:id="rIdm_s_uvk3fa339yuz0e9j-">
+      <w:hyperlink w:history="1" r:id="rIdlmgwhe4hfpm3nvlefivp5">
         <w:r>
           <w:rPr>
             <w:color w:val="000000"/>
@@ -875,8 +875,21 @@
           <w:sz w:val="18"/>
           <w:szCs w:val="18"/>
         </w:rPr>
-        <w:t xml:space="preserve">Table 2. Video evidence of the data collection.</w:t>
-      </w:r>
+        <w:t xml:space="preserve">Table 2. Video evidence of the data collection. All four are also in one folder: </w:t>
+      </w:r>
+      <w:hyperlink w:history="1" r:id="rIdczgqmm4nut-8sfz-kwpq4">
+        <w:r>
+          <w:rPr>
+            <w:i/>
+            <w:iCs/>
+            <w:color w:val="000000"/>
+            <w:sz w:val="18"/>
+            <w:szCs w:val="18"/>
+            <w:u w:val="single"/>
+          </w:rPr>
+          <w:t xml:space="preserve">drive.google.com/drive/folders/1qP9lk4-jdwW2zVzHJfrS-97dwyjKSSTp</w:t>
+        </w:r>
+      </w:hyperlink>
     </w:p>
     <w:tbl>
       <w:tblPr>
@@ -1018,13 +1031,17 @@
             <w:pPr>
               <w:jc w:val="left"/>
             </w:pPr>
-            <w:r>
-              <w:rPr>
-                <w:sz w:val="19"/>
-                <w:szCs w:val="19"/>
-              </w:rPr>
-              <w:t xml:space="preserve">[paste link]</w:t>
-            </w:r>
+            <w:hyperlink w:history="1" r:id="rIdngek3df5frciwoedc5kfz">
+              <w:r>
+                <w:rPr>
+                  <w:color w:val="000000"/>
+                  <w:sz w:val="19"/>
+                  <w:szCs w:val="19"/>
+                  <w:u w:val="single"/>
+                </w:rPr>
+                <w:t xml:space="preserve">drive.google.com/file/d/1DbuKi2fFGHKsp-Dc_dmSgkdPQfZGT58R/view</w:t>
+              </w:r>
+            </w:hyperlink>
           </w:p>
         </w:tc>
       </w:tr>
@@ -1080,13 +1097,17 @@
             <w:pPr>
               <w:jc w:val="left"/>
             </w:pPr>
-            <w:r>
-              <w:rPr>
-                <w:sz w:val="19"/>
-                <w:szCs w:val="19"/>
-              </w:rPr>
-              <w:t xml:space="preserve">[paste link]</w:t>
-            </w:r>
+            <w:hyperlink w:history="1" r:id="rIdtwvn6a9sywiqzxkz5brdl">
+              <w:r>
+                <w:rPr>
+                  <w:color w:val="000000"/>
+                  <w:sz w:val="19"/>
+                  <w:szCs w:val="19"/>
+                  <w:u w:val="single"/>
+                </w:rPr>
+                <w:t xml:space="preserve">drive.google.com/file/d/1qN1bkOZjtsGW4xYbjx5tOWmzon84elF-/view</w:t>
+              </w:r>
+            </w:hyperlink>
           </w:p>
         </w:tc>
       </w:tr>
@@ -1142,13 +1163,17 @@
             <w:pPr>
               <w:jc w:val="left"/>
             </w:pPr>
-            <w:r>
-              <w:rPr>
-                <w:sz w:val="19"/>
-                <w:szCs w:val="19"/>
-              </w:rPr>
-              <w:t xml:space="preserve">[paste link]</w:t>
-            </w:r>
+            <w:hyperlink w:history="1" r:id="rIdsxdonxb4itijunj0lgn2u">
+              <w:r>
+                <w:rPr>
+                  <w:color w:val="000000"/>
+                  <w:sz w:val="19"/>
+                  <w:szCs w:val="19"/>
+                  <w:u w:val="single"/>
+                </w:rPr>
+                <w:t xml:space="preserve">drive.google.com/file/d/1h8uUoRtdRANqKgtrE7Bfue7nX2O2b0dp/view</w:t>
+              </w:r>
+            </w:hyperlink>
           </w:p>
         </w:tc>
       </w:tr>
@@ -1204,13 +1229,17 @@
             <w:pPr>
               <w:jc w:val="left"/>
             </w:pPr>
-            <w:r>
-              <w:rPr>
-                <w:sz w:val="19"/>
-                <w:szCs w:val="19"/>
-              </w:rPr>
-              <w:t xml:space="preserve">[paste link]</w:t>
-            </w:r>
+            <w:hyperlink w:history="1" r:id="rIds8lzabccmtuvsgpff6e_s">
+              <w:r>
+                <w:rPr>
+                  <w:color w:val="000000"/>
+                  <w:sz w:val="19"/>
+                  <w:szCs w:val="19"/>
+                  <w:u w:val="single"/>
+                </w:rPr>
+                <w:t xml:space="preserve">drive.google.com/file/d/1k-YQIuRrEuhhP4bo9Cw2g9SsSArijBaa/view</w:t>
+              </w:r>
+            </w:hyperlink>
           </w:p>
         </w:tc>
       </w:tr>
@@ -1240,7 +1269,7 @@
                     </pic:cNvPicPr>
                   </pic:nvPicPr>
                   <pic:blipFill>
-                    <a:blip r:embed="rId9" cstate="none"/>
+                    <a:blip r:embed="rId14" cstate="none"/>
                     <a:srcRect/>
                     <a:stretch>
                       <a:fillRect/>
@@ -2492,7 +2521,7 @@
                     </pic:cNvPicPr>
                   </pic:nvPicPr>
                   <pic:blipFill>
-                    <a:blip r:embed="rId10" cstate="none"/>
+                    <a:blip r:embed="rId15" cstate="none"/>
                     <a:srcRect/>
                     <a:stretch>
                       <a:fillRect/>
@@ -3371,7 +3400,7 @@
                     </pic:cNvPicPr>
                   </pic:nvPicPr>
                   <pic:blipFill>
-                    <a:blip r:embed="rId11" cstate="none"/>
+                    <a:blip r:embed="rId16" cstate="none"/>
                     <a:srcRect/>
                     <a:stretch>
                       <a:fillRect/>
@@ -3459,7 +3488,7 @@
                     </pic:cNvPicPr>
                   </pic:nvPicPr>
                   <pic:blipFill>
-                    <a:blip r:embed="rId12" cstate="none"/>
+                    <a:blip r:embed="rId17" cstate="none"/>
                     <a:srcRect/>
                     <a:stretch>
                       <a:fillRect/>
@@ -3610,7 +3639,7 @@
                           </pic:cNvPicPr>
                         </pic:nvPicPr>
                         <pic:blipFill>
-                          <a:blip r:embed="rId13" cstate="none"/>
+                          <a:blip r:embed="rId18" cstate="none"/>
                           <a:srcRect/>
                           <a:stretch>
                             <a:fillRect/>
@@ -3683,7 +3712,7 @@
                           </pic:cNvPicPr>
                         </pic:nvPicPr>
                         <pic:blipFill>
-                          <a:blip r:embed="rId14" cstate="none"/>
+                          <a:blip r:embed="rId19" cstate="none"/>
                           <a:srcRect/>
                           <a:stretch>
                             <a:fillRect/>
@@ -3756,7 +3785,7 @@
                           </pic:cNvPicPr>
                         </pic:nvPicPr>
                         <pic:blipFill>
-                          <a:blip r:embed="rId15" cstate="none"/>
+                          <a:blip r:embed="rId20" cstate="none"/>
                           <a:srcRect/>
                           <a:stretch>
                             <a:fillRect/>

</xml_diff>

<commit_message>
report: fold feature extraction into section 2 so the headings match the brief
</commit_message>
<xml_diff>
--- a/report/report.docx
+++ b/report/report.docx
@@ -45,7 +45,7 @@
         </w:rPr>
         <w:t xml:space="preserve">Code and data: </w:t>
       </w:r>
-      <w:hyperlink w:history="1" r:id="rIdlmgwhe4hfpm3nvlefivp5">
+      <w:hyperlink w:history="1" r:id="rIdhnze74qzzlyifkklvm8-k">
         <w:r>
           <w:rPr>
             <w:color w:val="000000"/>
@@ -786,7 +786,7 @@
         <w:t xml:space="preserve">Training data</w:t>
       </w:r>
       <w:r>
-        <w:t xml:space="preserve"> (26 October, iPhone 11 Pro, recorded by me). I made one long recording per activity: standing 128 s with the phone at waist level, walking 122 s and still 122 s (phone flat on a table), plus five jumping takes of 23–39 s. Each recording was trimmed by 2 s at the start and 3 s at the end, which removes the moments of starting and stopping the app, and cut into 8 s files: 15 standing, 14 walking, 14 still and 12 jumping. I also recorded one 72 s session that goes still → standing → walking → jumping. In that session the moments where I picked the phone up or changed activity are left unlabelled and skipped. Every activity has at least 109 s of training data (standing 134 s, walking 130 s, jumping 110 s, still 127 s), above the 90 s minimum. Because the 8 s files come from a few long recordings, files from the same recording are not independent, so feature choice uses blocked folds (section 3).</w:t>
+        <w:t xml:space="preserve"> (26 October, iPhone 11 Pro, recorded by me). I made one long recording per activity: standing 128 s with the phone at waist level, walking 122 s and still 122 s (phone flat on a table), plus five jumping takes of 23–39 s. Each recording was trimmed by 2 s at the start and 3 s at the end, which removes the moments of starting and stopping the app, and cut into 8 s files: 15 standing, 14 walking, 14 still and 12 jumping. I also recorded one 72 s session that goes still → standing → walking → jumping. In that session the moments where I picked the phone up or changed activity are left unlabelled and skipped. Every activity has at least 109 s of training data (standing 134 s, walking 130 s, jumping 110 s, still 127 s), above the 90 s minimum. Because the 8 s files come from a few long recordings, files from the same recording are not independent, so feature choice uses blocked folds (see Feature extraction below).</w:t>
       </w:r>
     </w:p>
     <w:p>
@@ -848,7 +848,7 @@
         <w:t xml:space="preserve">50 Hz</w:t>
       </w:r>
       <w:r>
-        <w:t xml:space="preserve"> grid using its own timestamps, after which all phones look the same to the model. 50 Hz is plenty: walking repeats at about 1.5 Hz and jumping at about 2 Hz, and section 6 shows that nothing is lost even at 10 Hz. The signal is then cut into </w:t>
+        <w:t xml:space="preserve"> grid using its own timestamps, after which all phones look the same to the model. 50 Hz is plenty: walking repeats at about 1.5 Hz and jumping at about 2 Hz, and section 5 shows that nothing is lost even at 10 Hz. The signal is then cut into </w:t>
       </w:r>
       <w:r>
         <w:rPr>
@@ -877,7 +877,7 @@
         </w:rPr>
         <w:t xml:space="preserve">Table 2. Video evidence of the data collection. All four are also in one folder: </w:t>
       </w:r>
-      <w:hyperlink w:history="1" r:id="rIdczgqmm4nut-8sfz-kwpq4">
+      <w:hyperlink w:history="1" r:id="rId-zdo03yxn_iecghyqx7mj">
         <w:r>
           <w:rPr>
             <w:i/>
@@ -1031,7 +1031,7 @@
             <w:pPr>
               <w:jc w:val="left"/>
             </w:pPr>
-            <w:hyperlink w:history="1" r:id="rIdngek3df5frciwoedc5kfz">
+            <w:hyperlink w:history="1" r:id="rIdgctsdywil4pam5lrv-2xd">
               <w:r>
                 <w:rPr>
                   <w:color w:val="000000"/>
@@ -1097,7 +1097,7 @@
             <w:pPr>
               <w:jc w:val="left"/>
             </w:pPr>
-            <w:hyperlink w:history="1" r:id="rIdtwvn6a9sywiqzxkz5brdl">
+            <w:hyperlink w:history="1" r:id="rIdqk8xwychq7ol7s-nanrbh">
               <w:r>
                 <w:rPr>
                   <w:color w:val="000000"/>
@@ -1163,7 +1163,7 @@
             <w:pPr>
               <w:jc w:val="left"/>
             </w:pPr>
-            <w:hyperlink w:history="1" r:id="rIdsxdonxb4itijunj0lgn2u">
+            <w:hyperlink w:history="1" r:id="rIdiicyybwshcxnj-fxfmn8k">
               <w:r>
                 <w:rPr>
                   <w:color w:val="000000"/>
@@ -1229,7 +1229,7 @@
             <w:pPr>
               <w:jc w:val="left"/>
             </w:pPr>
-            <w:hyperlink w:history="1" r:id="rIds8lzabccmtuvsgpff6e_s">
+            <w:hyperlink w:history="1" r:id="rIdjt8fcmmmlbgnh7wsyobpk">
               <w:r>
                 <w:rPr>
                   <w:color w:val="000000"/>
@@ -1309,10 +1309,10 @@
     </w:p>
     <w:p>
       <w:pPr>
-        <w:pStyle w:val="Heading1"/>
-      </w:pPr>
-      <w:r>
-        <w:t xml:space="preserve">3. Feature extraction</w:t>
+        <w:pStyle w:val="Heading2"/>
+      </w:pPr>
+      <w:r>
+        <w:t xml:space="preserve">Feature extraction</w:t>
       </w:r>
     </w:p>
     <w:p>
@@ -2332,7 +2332,7 @@
         <w:pStyle w:val="Heading1"/>
       </w:pPr>
       <w:r>
-        <w:t xml:space="preserve">4. HMM setup and implementation</w:t>
+        <w:t xml:space="preserve">3. HMM setup and implementation</w:t>
       </w:r>
     </w:p>
     <w:p>
@@ -2564,7 +2564,7 @@
         <w:pStyle w:val="Heading1"/>
       </w:pPr>
       <w:r>
-        <w:t xml:space="preserve">5. Results and interpretation</w:t>
+        <w:t xml:space="preserve">4. Results and interpretation</w:t>
       </w:r>
     </w:p>
     <w:p>
@@ -3531,7 +3531,7 @@
         <w:pStyle w:val="Heading1"/>
       </w:pPr>
       <w:r>
-        <w:t xml:space="preserve">6. Discussion and conclusion</w:t>
+        <w:t xml:space="preserve">5. Discussion and conclusion</w:t>
       </w:r>
     </w:p>
     <w:p>
@@ -4204,17 +4204,6 @@
     <w:rPr>
       <w:sz w:val="56"/>
       <w:szCs w:val="56"/>
-    </w:rPr>
-  </w:style>
-  <w:style w:type="paragraph" w:styleId="Heading2">
-    <w:name w:val="Heading 2"/>
-    <w:basedOn w:val="Normal"/>
-    <w:next w:val="Normal"/>
-    <w:qFormat/>
-    <w:rPr>
-      <w:color w:val="2E74B5"/>
-      <w:sz w:val="26"/>
-      <w:szCs w:val="26"/>
     </w:rPr>
   </w:style>
   <w:style w:type="paragraph" w:styleId="Heading3">
@@ -4515,6 +4504,27 @@
       <w:szCs w:val="25"/>
     </w:rPr>
   </w:style>
+  <w:style w:type="paragraph" w:styleId="Heading2">
+    <w:name w:val="Heading 2"/>
+    <w:basedOn w:val="Normal"/>
+    <w:next w:val="Normal"/>
+    <w:qFormat/>
+    <w:pPr>
+      <w:keepNext/>
+      <w:spacing w:after="60" w:before="160"/>
+      <w:outlineLvl w:val="1"/>
+    </w:pPr>
+    <w:rPr>
+      <w:rFonts w:ascii="Times New Roman" w:cs="Times New Roman" w:eastAsia="Times New Roman" w:hAnsi="Times New Roman"/>
+      <w:b/>
+      <w:bCs/>
+      <w:i/>
+      <w:iCs/>
+      <w:color w:val="000000"/>
+      <w:sz w:val="23"/>
+      <w:szCs w:val="23"/>
+    </w:rPr>
+  </w:style>
 </w:styles>
 </file>
 

</xml_diff>